<commit_message>
Iniciado el modelado de la BD
</commit_message>
<xml_diff>
--- a/docs/pstiii.docx
+++ b/docs/pstiii.docx
@@ -420,7 +420,7 @@
           <w:sz w:val="24"/>
           <w:lang w:eastAsia="en-US"/>
         </w:rPr>
-        <w:t>Ing. Elsa Frandiño</w:t>
+        <w:t>Ing. Elsa F</w:t>
       </w:r>
       <w:r>
         <w:rPr>
@@ -429,7 +429,7 @@
           <w:sz w:val="24"/>
           <w:lang w:eastAsia="en-US"/>
         </w:rPr>
-        <w:tab/>
+        <w:t>andiño</w:t>
       </w:r>
       <w:r>
         <w:rPr>
@@ -466,6 +466,15 @@
           <w:lang w:eastAsia="en-US"/>
         </w:rPr>
         <w:tab/>
+      </w:r>
+      <w:r>
+        <w:rPr>
+          <w:rFonts w:ascii="Arial" w:eastAsia="Calibri" w:hAnsi="Arial" w:cs="Arial"/>
+          <w:b/>
+          <w:sz w:val="24"/>
+          <w:lang w:eastAsia="en-US"/>
+        </w:rPr>
+        <w:tab/>
         <w:t>Daniel Mancilla C.I. 27.668.711</w:t>
       </w:r>
     </w:p>
@@ -545,7 +554,7 @@
           <w:sz w:val="24"/>
           <w:lang w:eastAsia="en-US"/>
         </w:rPr>
-        <w:t>Ing. Emerson Navarro</w:t>
+        <w:t xml:space="preserve">Ing. Emerson </w:t>
       </w:r>
       <w:r>
         <w:rPr>
@@ -554,7 +563,7 @@
           <w:sz w:val="24"/>
           <w:lang w:eastAsia="en-US"/>
         </w:rPr>
-        <w:tab/>
+        <w:t>Navarro</w:t>
       </w:r>
       <w:r>
         <w:rPr>
@@ -582,7 +591,25 @@
           <w:lang w:eastAsia="en-US"/>
         </w:rPr>
         <w:tab/>
-        <w:t xml:space="preserve">Jenifer Lazaro C.I. </w:t>
+      </w:r>
+      <w:r>
+        <w:rPr>
+          <w:rFonts w:ascii="Arial" w:eastAsia="Calibri" w:hAnsi="Arial" w:cs="Arial"/>
+          <w:b/>
+          <w:sz w:val="24"/>
+          <w:lang w:eastAsia="en-US"/>
+        </w:rPr>
+        <w:tab/>
+        <w:t>Jenifer Lá</w:t>
+      </w:r>
+      <w:r>
+        <w:rPr>
+          <w:rFonts w:ascii="Arial" w:eastAsia="Calibri" w:hAnsi="Arial" w:cs="Arial"/>
+          <w:b/>
+          <w:sz w:val="24"/>
+          <w:lang w:eastAsia="en-US"/>
+        </w:rPr>
+        <w:t>zaro C.I.</w:t>
       </w:r>
     </w:p>
     <w:p>
@@ -596,6 +623,79 @@
           <w:lang w:eastAsia="en-US"/>
         </w:rPr>
       </w:pPr>
+      <w:r>
+        <w:rPr>
+          <w:rFonts w:ascii="Arial" w:eastAsia="Calibri" w:hAnsi="Arial" w:cs="Arial"/>
+          <w:b/>
+          <w:sz w:val="24"/>
+          <w:lang w:eastAsia="en-US"/>
+        </w:rPr>
+        <w:tab/>
+      </w:r>
+      <w:r>
+        <w:rPr>
+          <w:rFonts w:ascii="Arial" w:eastAsia="Calibri" w:hAnsi="Arial" w:cs="Arial"/>
+          <w:b/>
+          <w:sz w:val="24"/>
+          <w:lang w:eastAsia="en-US"/>
+        </w:rPr>
+        <w:t xml:space="preserve"> </w:t>
+      </w:r>
+      <w:r>
+        <w:rPr>
+          <w:rFonts w:ascii="Arial" w:eastAsia="Calibri" w:hAnsi="Arial" w:cs="Arial"/>
+          <w:b/>
+          <w:sz w:val="24"/>
+          <w:lang w:eastAsia="en-US"/>
+        </w:rPr>
+        <w:tab/>
+      </w:r>
+      <w:r>
+        <w:rPr>
+          <w:rFonts w:ascii="Arial" w:eastAsia="Calibri" w:hAnsi="Arial" w:cs="Arial"/>
+          <w:b/>
+          <w:sz w:val="24"/>
+          <w:lang w:eastAsia="en-US"/>
+        </w:rPr>
+        <w:tab/>
+      </w:r>
+      <w:r>
+        <w:rPr>
+          <w:rFonts w:ascii="Arial" w:eastAsia="Calibri" w:hAnsi="Arial" w:cs="Arial"/>
+          <w:b/>
+          <w:sz w:val="24"/>
+          <w:lang w:eastAsia="en-US"/>
+        </w:rPr>
+        <w:tab/>
+      </w:r>
+      <w:r>
+        <w:rPr>
+          <w:rFonts w:ascii="Arial" w:eastAsia="Calibri" w:hAnsi="Arial" w:cs="Arial"/>
+          <w:b/>
+          <w:sz w:val="24"/>
+          <w:lang w:eastAsia="en-US"/>
+        </w:rPr>
+        <w:tab/>
+      </w:r>
+      <w:r>
+        <w:rPr>
+          <w:rFonts w:ascii="Arial" w:eastAsia="Calibri" w:hAnsi="Arial" w:cs="Arial"/>
+          <w:b/>
+          <w:sz w:val="24"/>
+          <w:lang w:eastAsia="en-US"/>
+        </w:rPr>
+        <w:tab/>
+      </w:r>
+      <w:r>
+        <w:rPr>
+          <w:rFonts w:ascii="Arial" w:eastAsia="Calibri" w:hAnsi="Arial" w:cs="Arial"/>
+          <w:b/>
+          <w:sz w:val="24"/>
+          <w:lang w:eastAsia="en-US"/>
+        </w:rPr>
+        <w:tab/>
+        <w:t>Eliliana Marín C.I</w:t>
+      </w:r>
     </w:p>
     <w:p>
       <w:pPr>
@@ -865,7 +965,39 @@
           <w:color w:val="000000"/>
           <w:sz w:val="24"/>
         </w:rPr>
-        <w:t>La ubicación de la comunidad en la cual se realizará el proyecto es en el Municipio Caracciolo Parra y Olmedo, Parroquia Tucaní.</w:t>
+        <w:t xml:space="preserve">La ubicación de la comunidad en la cual se realizará el proyecto es en el </w:t>
+      </w:r>
+      <w:r>
+        <w:rPr>
+          <w:rFonts w:ascii="Arial" w:eastAsia="Times New Roman" w:hAnsi="Arial" w:cs="Times New Roman"/>
+          <w:color w:val="000000"/>
+          <w:sz w:val="24"/>
+        </w:rPr>
+        <w:t xml:space="preserve">Estado Mérida, </w:t>
+      </w:r>
+      <w:r>
+        <w:rPr>
+          <w:rFonts w:ascii="Arial" w:eastAsia="Times New Roman" w:hAnsi="Arial" w:cs="Times New Roman"/>
+          <w:color w:val="000000"/>
+          <w:sz w:val="24"/>
+        </w:rPr>
+        <w:t>Municipio Caracciolo Parra y Olmedo, Parroquia Tucaní</w:t>
+      </w:r>
+      <w:r>
+        <w:rPr>
+          <w:rFonts w:ascii="Arial" w:eastAsia="Times New Roman" w:hAnsi="Arial" w:cs="Times New Roman"/>
+          <w:color w:val="000000"/>
+          <w:sz w:val="24"/>
+        </w:rPr>
+        <w:t>, Sector Andrés Bello</w:t>
+      </w:r>
+      <w:r>
+        <w:rPr>
+          <w:rFonts w:ascii="Arial" w:eastAsia="Times New Roman" w:hAnsi="Arial" w:cs="Times New Roman"/>
+          <w:color w:val="000000"/>
+          <w:sz w:val="24"/>
+        </w:rPr>
+        <w:t>.</w:t>
       </w:r>
     </w:p>
     <w:p>
@@ -1074,7 +1206,31 @@
           <w:color w:val="000000"/>
           <w:sz w:val="24"/>
         </w:rPr>
-        <w:t xml:space="preserve">Gracias a al avance tecnológico actual y las Tics las personas pueden realizar sus tareas o actividades diarias de una manera más eficiente y eficaz, esto aplica en distintas áreas desde niveles agrícolas y recreativos a niveles de </w:t>
+        <w:t xml:space="preserve">Gracias </w:t>
+      </w:r>
+      <w:r>
+        <w:rPr>
+          <w:rFonts w:ascii="Arial" w:eastAsia="Times New Roman" w:hAnsi="Arial" w:cs="Times New Roman"/>
+          <w:color w:val="000000"/>
+          <w:sz w:val="24"/>
+        </w:rPr>
+        <w:t>al avan</w:t>
+      </w:r>
+      <w:r>
+        <w:rPr>
+          <w:rFonts w:ascii="Arial" w:eastAsia="Times New Roman" w:hAnsi="Arial" w:cs="Times New Roman"/>
+          <w:color w:val="000000"/>
+          <w:sz w:val="24"/>
+        </w:rPr>
+        <w:t>ce tecnológico actual y las TICS,</w:t>
+      </w:r>
+      <w:r>
+        <w:rPr>
+          <w:rFonts w:ascii="Arial" w:eastAsia="Times New Roman" w:hAnsi="Arial" w:cs="Times New Roman"/>
+          <w:color w:val="000000"/>
+          <w:sz w:val="24"/>
+        </w:rPr>
+        <w:t xml:space="preserve"> las personas pueden realizar sus tareas o actividades diarias de una manera más eficiente y eficaz, esto aplica </w:t>
       </w:r>
       <w:r>
         <w:rPr>
@@ -1083,38 +1239,238 @@
           <w:sz w:val="24"/>
         </w:rPr>
         <w:lastRenderedPageBreak/>
-        <w:t>estudio-científico. Esto es gracias a que la informática trata de solventar todos los problemas de las personas como medios de comunicación, programas de investigaciones, sistemas para empresas industriales, etc. Por ende, actualmente se trata de automatizar todas las actividades posibles para un mejor desempeño de las áreas de trabajo de los ciudadanos, para así reducir loa carga de trabajo y ahorrar tiempo en ello para poder ser una mejor sociedad de lo que ya es.</w:t>
-      </w:r>
-    </w:p>
-    <w:p>
-      <w:pPr>
-        <w:spacing w:line="360" w:lineRule="auto"/>
-        <w:jc w:val="both"/>
-        <w:rPr>
-          <w:rFonts w:ascii="Arial" w:eastAsia="Times New Roman" w:hAnsi="Arial" w:cs="Times New Roman"/>
-          <w:color w:val="000000"/>
-          <w:sz w:val="24"/>
-        </w:rPr>
-      </w:pPr>
-    </w:p>
-    <w:p>
-      <w:pPr>
-        <w:spacing w:line="360" w:lineRule="auto"/>
-        <w:jc w:val="both"/>
-        <w:rPr>
-          <w:rFonts w:ascii="Arial" w:eastAsia="Times New Roman" w:hAnsi="Arial" w:cs="Times New Roman"/>
-          <w:color w:val="000000"/>
-          <w:sz w:val="24"/>
-        </w:rPr>
-      </w:pPr>
-      <w:r>
-        <w:rPr>
-          <w:rFonts w:ascii="Arial" w:eastAsia="Times New Roman" w:hAnsi="Arial" w:cs="Times New Roman"/>
-          <w:color w:val="000000"/>
-          <w:sz w:val="24"/>
-        </w:rPr>
-        <w:tab/>
-        <w:t>No obstante la salud no está fuera del interés informático, ya que se han creado distintos sistemas para hacer las labores medicas mas sencillas a tal grado que se puede operar un paciente a distancia o hacer simulaciones en caso de futuras emergencias. Dado la tasa de mortalidad anual, se trata de mejorar todos los medios posibles para los hospitales para que ofrezcan mejores servicios a sus pacientes; tal cual es el caso del Hospital General Municipal Antonio José Uzcátegui ubicado en el Municipio Caracciolo Parra y Olmedo, Parroquia Tucaní, el cual ofrece buen servicio a todos los pacientes, pero aun así carece de un sistema automatizado que pueda facilitar el registro y control de los pacientes, y el almacén de suministros.</w:t>
+        <w:t xml:space="preserve">en distintas áreas desde niveles agrícolas y recreativos a niveles de estudio-científico. Esto es gracias a que la informática trata de solventar todos los problemas de las personas como medios de comunicación, programas de investigaciones, sistemas para empresas industriales, </w:t>
+      </w:r>
+      <w:r>
+        <w:rPr>
+          <w:rFonts w:ascii="Arial" w:eastAsia="Times New Roman" w:hAnsi="Arial" w:cs="Times New Roman"/>
+          <w:color w:val="000000"/>
+          <w:sz w:val="24"/>
+        </w:rPr>
+        <w:t>entre otros</w:t>
+      </w:r>
+      <w:r>
+        <w:rPr>
+          <w:rFonts w:ascii="Arial" w:eastAsia="Times New Roman" w:hAnsi="Arial" w:cs="Times New Roman"/>
+          <w:color w:val="000000"/>
+          <w:sz w:val="24"/>
+        </w:rPr>
+        <w:t xml:space="preserve">. Por ende, actualmente se trata de automatizar todas las actividades posibles para un mejor desempeño de las áreas de </w:t>
+      </w:r>
+      <w:r>
+        <w:rPr>
+          <w:rFonts w:ascii="Arial" w:eastAsia="Times New Roman" w:hAnsi="Arial" w:cs="Times New Roman"/>
+          <w:color w:val="000000"/>
+          <w:sz w:val="24"/>
+        </w:rPr>
+        <w:t>trabajo de los ciudadanos, así reducir la carga</w:t>
+      </w:r>
+      <w:r>
+        <w:rPr>
+          <w:rFonts w:ascii="Arial" w:eastAsia="Times New Roman" w:hAnsi="Arial" w:cs="Times New Roman"/>
+          <w:color w:val="000000"/>
+          <w:sz w:val="24"/>
+        </w:rPr>
+        <w:t xml:space="preserve"> </w:t>
+      </w:r>
+      <w:r>
+        <w:rPr>
+          <w:rFonts w:ascii="Arial" w:eastAsia="Times New Roman" w:hAnsi="Arial" w:cs="Times New Roman"/>
+          <w:color w:val="000000"/>
+          <w:sz w:val="24"/>
+        </w:rPr>
+        <w:t xml:space="preserve">laboral </w:t>
+      </w:r>
+      <w:r>
+        <w:rPr>
+          <w:rFonts w:ascii="Arial" w:eastAsia="Times New Roman" w:hAnsi="Arial" w:cs="Times New Roman"/>
+          <w:color w:val="000000"/>
+          <w:sz w:val="24"/>
+        </w:rPr>
+        <w:t xml:space="preserve">y ahorrar tiempo en ello para poder ser una mejor </w:t>
+      </w:r>
+      <w:r>
+        <w:rPr>
+          <w:rFonts w:ascii="Arial" w:eastAsia="Times New Roman" w:hAnsi="Arial" w:cs="Times New Roman"/>
+          <w:color w:val="000000"/>
+          <w:sz w:val="24"/>
+        </w:rPr>
+        <w:t>so</w:t>
+      </w:r>
+      <w:bookmarkStart w:id="2" w:name="_GoBack"/>
+      <w:bookmarkEnd w:id="2"/>
+      <w:r>
+        <w:rPr>
+          <w:rFonts w:ascii="Arial" w:eastAsia="Times New Roman" w:hAnsi="Arial" w:cs="Times New Roman"/>
+          <w:color w:val="000000"/>
+          <w:sz w:val="24"/>
+        </w:rPr>
+        <w:t>ciedad</w:t>
+      </w:r>
+      <w:r>
+        <w:rPr>
+          <w:rFonts w:ascii="Arial" w:eastAsia="Times New Roman" w:hAnsi="Arial" w:cs="Times New Roman"/>
+          <w:color w:val="000000"/>
+          <w:sz w:val="24"/>
+        </w:rPr>
+        <w:t xml:space="preserve"> de lo que ya es.</w:t>
+      </w:r>
+    </w:p>
+    <w:p>
+      <w:pPr>
+        <w:spacing w:line="360" w:lineRule="auto"/>
+        <w:jc w:val="both"/>
+        <w:rPr>
+          <w:rFonts w:ascii="Arial" w:eastAsia="Times New Roman" w:hAnsi="Arial" w:cs="Times New Roman"/>
+          <w:color w:val="000000"/>
+          <w:sz w:val="24"/>
+        </w:rPr>
+      </w:pPr>
+    </w:p>
+    <w:p>
+      <w:pPr>
+        <w:spacing w:line="360" w:lineRule="auto"/>
+        <w:jc w:val="both"/>
+        <w:rPr>
+          <w:rFonts w:ascii="Arial" w:eastAsia="Times New Roman" w:hAnsi="Arial" w:cs="Times New Roman"/>
+          <w:color w:val="000000"/>
+          <w:sz w:val="24"/>
+        </w:rPr>
+      </w:pPr>
+      <w:r>
+        <w:rPr>
+          <w:rFonts w:ascii="Arial" w:eastAsia="Times New Roman" w:hAnsi="Arial" w:cs="Times New Roman"/>
+          <w:color w:val="000000"/>
+          <w:sz w:val="24"/>
+        </w:rPr>
+        <w:tab/>
+        <w:t>No obstante el área de la salud</w:t>
+      </w:r>
+      <w:r>
+        <w:rPr>
+          <w:rFonts w:ascii="Arial" w:eastAsia="Times New Roman" w:hAnsi="Arial" w:cs="Times New Roman"/>
+          <w:color w:val="000000"/>
+          <w:sz w:val="24"/>
+        </w:rPr>
+        <w:t xml:space="preserve"> no está fuera del interés informático, ya que se han creado distintos sistemas p</w:t>
+      </w:r>
+      <w:r>
+        <w:rPr>
+          <w:rFonts w:ascii="Arial" w:eastAsia="Times New Roman" w:hAnsi="Arial" w:cs="Times New Roman"/>
+          <w:color w:val="000000"/>
+          <w:sz w:val="24"/>
+        </w:rPr>
+        <w:t>ara hacer las labores medicas má</w:t>
+      </w:r>
+      <w:r>
+        <w:rPr>
+          <w:rFonts w:ascii="Arial" w:eastAsia="Times New Roman" w:hAnsi="Arial" w:cs="Times New Roman"/>
+          <w:color w:val="000000"/>
+          <w:sz w:val="24"/>
+        </w:rPr>
+        <w:t>s sencillas a tal grado que se puede operar un paciente a distancia o hacer simulaciones en caso de futuras emergencias. Dado la tasa de mortalidad anual, se trata de mejorar todos los medios posib</w:t>
+      </w:r>
+      <w:r>
+        <w:rPr>
+          <w:rFonts w:ascii="Arial" w:eastAsia="Times New Roman" w:hAnsi="Arial" w:cs="Times New Roman"/>
+          <w:color w:val="000000"/>
+          <w:sz w:val="24"/>
+        </w:rPr>
+        <w:t xml:space="preserve">les para los hospitales, de manera </w:t>
+      </w:r>
+      <w:r>
+        <w:rPr>
+          <w:rFonts w:ascii="Arial" w:eastAsia="Times New Roman" w:hAnsi="Arial" w:cs="Times New Roman"/>
+          <w:color w:val="000000"/>
+          <w:sz w:val="24"/>
+        </w:rPr>
+        <w:t xml:space="preserve">que ofrezcan mejores servicios a sus pacientes; tal cual es el caso del Hospital General Municipal </w:t>
+      </w:r>
+      <w:r>
+        <w:rPr>
+          <w:rFonts w:ascii="Arial" w:eastAsia="Times New Roman" w:hAnsi="Arial" w:cs="Times New Roman"/>
+          <w:color w:val="000000"/>
+          <w:sz w:val="24"/>
+        </w:rPr>
+        <w:t xml:space="preserve">de Tucaní </w:t>
+      </w:r>
+      <w:r>
+        <w:rPr>
+          <w:rFonts w:ascii="Arial" w:eastAsia="Times New Roman" w:hAnsi="Arial" w:cs="Times New Roman"/>
+          <w:color w:val="000000"/>
+          <w:sz w:val="24"/>
+        </w:rPr>
+        <w:t xml:space="preserve">Antonio José Uzcátegui, el cual ofrece buen servicio </w:t>
+      </w:r>
+      <w:r>
+        <w:rPr>
+          <w:rFonts w:ascii="Arial" w:eastAsia="Times New Roman" w:hAnsi="Arial" w:cs="Times New Roman"/>
+          <w:color w:val="000000"/>
+          <w:sz w:val="24"/>
+        </w:rPr>
+        <w:t xml:space="preserve">de suministro de medicamentos </w:t>
+      </w:r>
+      <w:r>
+        <w:rPr>
+          <w:rFonts w:ascii="Arial" w:eastAsia="Times New Roman" w:hAnsi="Arial" w:cs="Times New Roman"/>
+          <w:color w:val="000000"/>
+          <w:sz w:val="24"/>
+        </w:rPr>
+        <w:t>a todos</w:t>
+      </w:r>
+      <w:r>
+        <w:rPr>
+          <w:rFonts w:ascii="Arial" w:eastAsia="Times New Roman" w:hAnsi="Arial" w:cs="Times New Roman"/>
+          <w:color w:val="000000"/>
+          <w:sz w:val="24"/>
+        </w:rPr>
+        <w:t xml:space="preserve"> los pacientes, sin embargo este proceso actualmente se lleva manualmente, mediante registros contables para la</w:t>
+      </w:r>
+    </w:p>
+    <w:p>
+      <w:pPr>
+        <w:spacing w:line="360" w:lineRule="auto"/>
+        <w:jc w:val="both"/>
+        <w:rPr>
+          <w:rFonts w:ascii="Arial" w:eastAsia="Times New Roman" w:hAnsi="Arial" w:cs="Times New Roman"/>
+          <w:color w:val="000000"/>
+          <w:sz w:val="24"/>
+        </w:rPr>
+      </w:pPr>
+    </w:p>
+    <w:p>
+      <w:pPr>
+        <w:spacing w:line="360" w:lineRule="auto"/>
+        <w:jc w:val="both"/>
+        <w:rPr>
+          <w:rFonts w:ascii="Arial" w:eastAsia="Times New Roman" w:hAnsi="Arial" w:cs="Times New Roman"/>
+          <w:color w:val="000000"/>
+          <w:sz w:val="24"/>
+        </w:rPr>
+      </w:pPr>
+      <w:r>
+        <w:rPr>
+          <w:rFonts w:ascii="Arial" w:eastAsia="Times New Roman" w:hAnsi="Arial" w:cs="Times New Roman"/>
+          <w:color w:val="000000"/>
+          <w:sz w:val="24"/>
+        </w:rPr>
+        <w:t>pero aun así carece de un sistema automatizado que pueda facili</w:t>
+      </w:r>
+      <w:r>
+        <w:rPr>
+          <w:rFonts w:ascii="Arial" w:eastAsia="Times New Roman" w:hAnsi="Arial" w:cs="Times New Roman"/>
+          <w:color w:val="000000"/>
+          <w:sz w:val="24"/>
+        </w:rPr>
+        <w:t>tar el registro y control de dichos pacientes</w:t>
+      </w:r>
+      <w:r>
+        <w:rPr>
+          <w:rFonts w:ascii="Arial" w:eastAsia="Times New Roman" w:hAnsi="Arial" w:cs="Times New Roman"/>
+          <w:color w:val="000000"/>
+          <w:sz w:val="24"/>
+        </w:rPr>
+        <w:t>, y el almacén de suministros.</w:t>
       </w:r>
     </w:p>
     <w:p>
@@ -1175,17 +1531,9 @@
           <w:color w:val="000000"/>
           <w:sz w:val="24"/>
         </w:rPr>
-        <w:tab/>
-        <w:t xml:space="preserve">Por tanto, se realizará un sistema automatizado de registro y control, el cual cubra las necesidades de la central de suministros y almacén del Hospital General Municipal Antonio José Uzcátegui, que pueda llevar un inventario digital, seguridad de datos, detallar los procesos de gestión de cada nuevo miembro laboral, ahorrar </w:t>
-      </w:r>
-      <w:r>
-        <w:rPr>
-          <w:rFonts w:ascii="Arial" w:eastAsia="Times New Roman" w:hAnsi="Arial" w:cs="Times New Roman"/>
-          <w:color w:val="000000"/>
-          <w:sz w:val="24"/>
-        </w:rPr>
         <w:lastRenderedPageBreak/>
-        <w:t>tiempo en registros, registro detallado de los pacientes y medicamentos; también en busca de que el sistema sea flexible para que los usuarios finales se puedan adatar fácilmente al sistema sin ningún inconveniente o problema teniendo en cuenta los estándares de calidad.</w:t>
+        <w:tab/>
+        <w:t>Por tanto, se realizará un sistema automatizado de registro y control, el cual cubra las necesidades de la central de suministros y almacén del Hospital General Municipal Antonio José Uzcátegui, que pueda llevar un inventario digital, seguridad de datos, detallar los procesos de gestión de cada nuevo miembro laboral, ahorrar tiempo en registros, registro detallado de los pacientes y medicamentos; también en busca de que el sistema sea flexible para que los usuarios finales se puedan adatar fácilmente al sistema sin ningún inconveniente o problema teniendo en cuenta los estándares de calidad.</w:t>
       </w:r>
     </w:p>
     <w:p>
@@ -1537,6 +1885,7 @@
           <w:color w:val="000000"/>
           <w:sz w:val="24"/>
         </w:rPr>
+        <w:lastRenderedPageBreak/>
         <w:t>Dar garantía de mantenimiento al sistema en caso de ser necesario.</w:t>
       </w:r>
     </w:p>
@@ -1579,7 +1928,6 @@
           <w:sz w:val="28"/>
           <w:szCs w:val="26"/>
         </w:rPr>
-        <w:lastRenderedPageBreak/>
         <w:t>Delimitación del Proyecto</w:t>
       </w:r>
     </w:p>
@@ -3171,7 +3519,6 @@
           <w:color w:val="000000"/>
           <w:sz w:val="24"/>
         </w:rPr>
-        <w:lastRenderedPageBreak/>
         <w:t>Autor: ALEGSA -Definición de PHP.</w:t>
       </w:r>
     </w:p>
@@ -3390,8 +3737,6 @@
           <w:sz w:val="24"/>
         </w:rPr>
       </w:pPr>
-      <w:bookmarkStart w:id="2" w:name="_GoBack"/>
-      <w:bookmarkEnd w:id="2"/>
     </w:p>
     <w:p>
       <w:pPr>
@@ -3410,16 +3755,7 @@
           <w:sz w:val="24"/>
         </w:rPr>
         <w:tab/>
-        <w:t xml:space="preserve">La base de datos de MySQL, por lo tanto, se distribuye de distintas maneras. Hay una versión con licencia pública general de GNU (la denominada Community Edition) y otras orientadas a empresas que brindan servicios y </w:t>
-      </w:r>
-      <w:r>
-        <w:rPr>
-          <w:rFonts w:ascii="Arial" w:eastAsia="Calibri" w:hAnsi="Arial" w:cs="Arial"/>
-          <w:color w:val="000000"/>
-          <w:sz w:val="24"/>
-        </w:rPr>
-        <w:lastRenderedPageBreak/>
-        <w:t>productos adicionales. Cabe destacar que Facebook, YouTube y Twitter, entre otros de los sitios web más visitados del mundo, trabajan con MySQL.</w:t>
+        <w:t>La base de datos de MySQL, por lo tanto, se distribuye de distintas maneras. Hay una versión con licencia pública general de GNU (la denominada Community Edition) y otras orientadas a empresas que brindan servicios y productos adicionales. Cabe destacar que Facebook, YouTube y Twitter, entre otros de los sitios web más visitados del mundo, trabajan con MySQL.</w:t>
       </w:r>
     </w:p>
     <w:p>
@@ -3816,26 +4152,26 @@
         <w:rPr>
           <w:rFonts w:ascii="Calibri" w:eastAsia="Calibri" w:hAnsi="Calibri" w:cs="Calibri"/>
         </w:rPr>
+        <w:tab/>
+        <w:t>TÉCNICAS E INSTRUMENTOS DE RECOLECCIÓN DE DATOS</w:t>
+      </w:r>
+    </w:p>
+    <w:p>
+      <w:pPr>
+        <w:spacing w:after="200" w:line="276" w:lineRule="auto"/>
+        <w:jc w:val="both"/>
+        <w:rPr>
+          <w:rFonts w:ascii="Calibri" w:eastAsia="Calibri" w:hAnsi="Calibri" w:cs="Calibri"/>
+          <w:color w:val="000000"/>
+          <w:sz w:val="24"/>
+        </w:rPr>
+      </w:pPr>
+      <w:r>
+        <w:rPr>
+          <w:rFonts w:ascii="Calibri" w:eastAsia="Calibri" w:hAnsi="Calibri" w:cs="Calibri"/>
+        </w:rPr>
         <w:lastRenderedPageBreak/>
         <w:tab/>
-        <w:t>TÉCNICAS E INSTRUMENTOS DE RECOLECCIÓN DE DATOS</w:t>
-      </w:r>
-    </w:p>
-    <w:p>
-      <w:pPr>
-        <w:spacing w:after="200" w:line="276" w:lineRule="auto"/>
-        <w:jc w:val="both"/>
-        <w:rPr>
-          <w:rFonts w:ascii="Calibri" w:eastAsia="Calibri" w:hAnsi="Calibri" w:cs="Calibri"/>
-          <w:color w:val="000000"/>
-          <w:sz w:val="24"/>
-        </w:rPr>
-      </w:pPr>
-      <w:r>
-        <w:rPr>
-          <w:rFonts w:ascii="Calibri" w:eastAsia="Calibri" w:hAnsi="Calibri" w:cs="Calibri"/>
-        </w:rPr>
-        <w:tab/>
         <w:t>ESTUDIO DE FACTIBILIDAD</w:t>
       </w:r>
     </w:p>
@@ -4512,37 +4848,37 @@
         <w:rPr>
           <w:rFonts w:ascii="Calibri" w:eastAsia="Calibri" w:hAnsi="Calibri" w:cs="Calibri"/>
         </w:rPr>
+        <w:tab/>
+      </w:r>
+      <w:r>
+        <w:rPr>
+          <w:rFonts w:ascii="Calibri" w:eastAsia="Calibri" w:hAnsi="Calibri" w:cs="Calibri"/>
+        </w:rPr>
+        <w:tab/>
+      </w:r>
+      <w:r>
+        <w:rPr>
+          <w:rFonts w:ascii="Calibri" w:eastAsia="Calibri" w:hAnsi="Calibri" w:cs="Calibri"/>
+        </w:rPr>
+        <w:tab/>
+        <w:t>PANTALLAS</w:t>
+      </w:r>
+    </w:p>
+    <w:p>
+      <w:pPr>
+        <w:spacing w:after="200" w:line="276" w:lineRule="auto"/>
+        <w:jc w:val="both"/>
+        <w:rPr>
+          <w:rFonts w:ascii="Calibri" w:eastAsia="Calibri" w:hAnsi="Calibri" w:cs="Calibri"/>
+          <w:color w:val="000000"/>
+          <w:sz w:val="24"/>
+        </w:rPr>
+      </w:pPr>
+      <w:r>
+        <w:rPr>
+          <w:rFonts w:ascii="Calibri" w:eastAsia="Calibri" w:hAnsi="Calibri" w:cs="Calibri"/>
+        </w:rPr>
         <w:lastRenderedPageBreak/>
-        <w:tab/>
-      </w:r>
-      <w:r>
-        <w:rPr>
-          <w:rFonts w:ascii="Calibri" w:eastAsia="Calibri" w:hAnsi="Calibri" w:cs="Calibri"/>
-        </w:rPr>
-        <w:tab/>
-      </w:r>
-      <w:r>
-        <w:rPr>
-          <w:rFonts w:ascii="Calibri" w:eastAsia="Calibri" w:hAnsi="Calibri" w:cs="Calibri"/>
-        </w:rPr>
-        <w:tab/>
-        <w:t>PANTALLAS</w:t>
-      </w:r>
-    </w:p>
-    <w:p>
-      <w:pPr>
-        <w:spacing w:after="200" w:line="276" w:lineRule="auto"/>
-        <w:jc w:val="both"/>
-        <w:rPr>
-          <w:rFonts w:ascii="Calibri" w:eastAsia="Calibri" w:hAnsi="Calibri" w:cs="Calibri"/>
-          <w:color w:val="000000"/>
-          <w:sz w:val="24"/>
-        </w:rPr>
-      </w:pPr>
-      <w:r>
-        <w:rPr>
-          <w:rFonts w:ascii="Calibri" w:eastAsia="Calibri" w:hAnsi="Calibri" w:cs="Calibri"/>
-        </w:rPr>
         <w:tab/>
       </w:r>
       <w:r>

</xml_diff>